<commit_message>
corregir errores para poder generar pdfx
</commit_message>
<xml_diff>
--- a/public/plantillas/intenciones.docx
+++ b/public/plantillas/intenciones.docx
@@ -4,7 +4,7 @@
   <w:body>
     <w:tbl>
       <w:tblPr>
-        <w:tblpPr w:vertAnchor="text" w:horzAnchor="margin" w:tblpXSpec="center" w:leftFromText="141" w:rightFromText="141" w:tblpY="7874"/>
+        <w:tblpPr w:bottomFromText="0" w:horzAnchor="margin" w:leftFromText="141" w:rightFromText="141" w:tblpX="0" w:tblpXSpec="center" w:tblpY="7874" w:topFromText="0" w:vertAnchor="text"/>
         <w:tblW w:w="10728" w:type="dxa"/>
         <w:jc w:val="left"/>
         <w:tblInd w:w="-5" w:type="dxa"/>
@@ -126,33 +126,7 @@
                 <w:szCs w:val="28"/>
                 <w:lang w:val="es-MX"/>
               </w:rPr>
-              <w:t>${</w:t>
-            </w:r>
-            <w:r>
-              <w:rPr>
-                <w:b w:val="false"/>
-                <w:bCs w:val="false"/>
-                <w:i w:val="false"/>
-                <w:iCs w:val="false"/>
-                <w:color w:val="000000"/>
-                <w:sz w:val="32"/>
-                <w:szCs w:val="28"/>
-                <w:lang w:val="es-MX"/>
-              </w:rPr>
-              <w:t>acciondegracias</w:t>
-            </w:r>
-            <w:r>
-              <w:rPr>
-                <w:b w:val="false"/>
-                <w:bCs w:val="false"/>
-                <w:i w:val="false"/>
-                <w:iCs w:val="false"/>
-                <w:color w:val="000000"/>
-                <w:sz w:val="32"/>
-                <w:szCs w:val="28"/>
-                <w:lang w:val="es-MX"/>
-              </w:rPr>
-              <w:t>}</w:t>
+              <w:t>${accion_de_gracias}</w:t>
             </w:r>
           </w:p>
         </w:tc>
@@ -240,46 +214,7 @@
                 <w:szCs w:val="28"/>
                 <w:lang w:val="es-MX"/>
               </w:rPr>
-              <w:t xml:space="preserve"> </w:t>
-            </w:r>
-            <w:r>
-              <w:rPr>
-                <w:b w:val="false"/>
-                <w:bCs w:val="false"/>
-                <w:i w:val="false"/>
-                <w:iCs w:val="false"/>
-                <w:color w:val="000000"/>
-                <w:sz w:val="32"/>
-                <w:szCs w:val="28"/>
-                <w:lang w:val="es-MX"/>
-              </w:rPr>
-              <w:t>${</w:t>
-            </w:r>
-            <w:r>
-              <w:rPr>
-                <w:b w:val="false"/>
-                <w:bCs w:val="false"/>
-                <w:i w:val="false"/>
-                <w:iCs w:val="false"/>
-                <w:color w:val="000000"/>
-                <w:sz w:val="32"/>
-                <w:szCs w:val="28"/>
-                <w:lang w:val="es-MX"/>
-              </w:rPr>
-              <w:t>salud</w:t>
-            </w:r>
-            <w:r>
-              <w:rPr>
-                <w:b w:val="false"/>
-                <w:bCs w:val="false"/>
-                <w:i w:val="false"/>
-                <w:iCs w:val="false"/>
-                <w:color w:val="000000"/>
-                <w:sz w:val="32"/>
-                <w:szCs w:val="28"/>
-                <w:lang w:val="es-MX"/>
-              </w:rPr>
-              <w:t>}</w:t>
+              <w:t xml:space="preserve"> ${salud}</w:t>
             </w:r>
           </w:p>
         </w:tc>
@@ -367,46 +302,7 @@
                 <w:szCs w:val="28"/>
                 <w:lang w:val="es-MX"/>
               </w:rPr>
-              <w:t xml:space="preserve"> </w:t>
-            </w:r>
-            <w:r>
-              <w:rPr>
-                <w:b w:val="false"/>
-                <w:bCs w:val="false"/>
-                <w:i w:val="false"/>
-                <w:iCs w:val="false"/>
-                <w:color w:val="000000"/>
-                <w:sz w:val="32"/>
-                <w:szCs w:val="28"/>
-                <w:lang w:val="es-MX"/>
-              </w:rPr>
-              <w:t>${</w:t>
-            </w:r>
-            <w:r>
-              <w:rPr>
-                <w:b w:val="false"/>
-                <w:bCs w:val="false"/>
-                <w:i w:val="false"/>
-                <w:iCs w:val="false"/>
-                <w:color w:val="000000"/>
-                <w:sz w:val="32"/>
-                <w:szCs w:val="28"/>
-                <w:lang w:val="es-MX"/>
-              </w:rPr>
-              <w:t>aniversarios</w:t>
-            </w:r>
-            <w:r>
-              <w:rPr>
-                <w:b w:val="false"/>
-                <w:bCs w:val="false"/>
-                <w:i w:val="false"/>
-                <w:iCs w:val="false"/>
-                <w:color w:val="000000"/>
-                <w:sz w:val="32"/>
-                <w:szCs w:val="28"/>
-                <w:lang w:val="es-MX"/>
-              </w:rPr>
-              <w:t>}</w:t>
+              <w:t xml:space="preserve"> ${aniversarios}</w:t>
             </w:r>
           </w:p>
         </w:tc>
@@ -472,6 +368,19 @@
             </w:pPr>
             <w:r>
               <w:rPr>
+                <w:b/>
+                <w:bCs/>
+                <w:i w:val="false"/>
+                <w:iCs w:val="false"/>
+                <w:color w:val="000000"/>
+                <w:sz w:val="32"/>
+                <w:szCs w:val="28"/>
+                <w:lang w:val="es-MX"/>
+              </w:rPr>
+              <w:t>DIFUNTOS:</w:t>
+            </w:r>
+            <w:r>
+              <w:rPr>
                 <w:b w:val="false"/>
                 <w:bCs w:val="false"/>
                 <w:i w:val="false"/>
@@ -481,7 +390,7 @@
                 <w:szCs w:val="28"/>
                 <w:lang w:val="es-MX"/>
               </w:rPr>
-              <w:t>${</w:t>
+              <w:t xml:space="preserve"> </w:t>
             </w:r>
             <w:r>
               <w:rPr>
@@ -494,7 +403,7 @@
                 <w:szCs w:val="28"/>
                 <w:lang w:val="es-MX"/>
               </w:rPr>
-              <w:t>d</w:t>
+              <w:t>${difunto</w:t>
             </w:r>
             <w:r>
               <w:rPr>
@@ -507,7 +416,20 @@
                 <w:szCs w:val="28"/>
                 <w:lang w:val="es-MX"/>
               </w:rPr>
-              <w:t>ifunto}</w:t>
+              <w:t>s</w:t>
+            </w:r>
+            <w:r>
+              <w:rPr>
+                <w:b w:val="false"/>
+                <w:bCs w:val="false"/>
+                <w:i w:val="false"/>
+                <w:iCs w:val="false"/>
+                <w:color w:val="000000"/>
+                <w:sz w:val="32"/>
+                <w:szCs w:val="28"/>
+                <w:lang w:val="es-MX"/>
+              </w:rPr>
+              <w:t>}</w:t>
             </w:r>
           </w:p>
         </w:tc>
@@ -838,7 +760,6 @@
           <w:color w:val="000000"/>
         </w:rPr>
       </w:pPr>
-      <w:r/>
       <w:r>
         <w:rPr>
           <w:b/>

</xml_diff>